<commit_message>
Ajustar estilo del indice automatico (Arial 11, alineacion izquierda)
</commit_message>
<xml_diff>
--- a/EP3 - Informe de Certificacion - Atlas (con evidencias).docx
+++ b/EP3 - Informe de Certificacion - Atlas (con evidencias).docx
@@ -2283,10 +2283,7 @@
         <w:t>Contexto del sistema a evaluar.</w:t>
       </w:r>
       <w:r>
-        <w:t xml:space="preserve"> Atlas es una plataforma web de gestión de clientes y contratos orientada a pequeñas y medianas empresas (pymes) de Chile. El sistema se estructura en tres capas: un frontend construido con React y Material UI (SPA responsiva), un backend con Express/Node.js que expone una API REST, y una base de datos PostgreSQL. Permite a usuarios registrados por empresa gestionar clientes, contratos y documentos asociados, administrar usuarios y roles (administrador/editor), auditar acciones críticas y gestionar el ciclo</w:t>
-      </w:r>
-      <w:r>
-        <w:t xml:space="preserve"> de vida de los contratos.</w:t>
+        <w:t xml:space="preserve"> Atlas es una plataforma web de gestión de clientes y contratos orientada a pequeñas y medianas empresas (pymes) de Chile. El sistema se estructura en tres capas: un frontend construido con React y Material UI (SPA responsiva), un backend con Express/Node.js que expone una API REST, y una base de datos PostgreSQL. Permite a usuarios registrados por empresa gestionar clientes, contratos y documentos asociados, administrar usuarios y roles (administrador/editor), auditar acciones críticas y gestionar el ciclo de vida de los contratos.</w:t>
       </w:r>
     </w:p>
     <w:p>
@@ -2297,10 +2294,7 @@
         <w:t>Propósito del informe.</w:t>
       </w:r>
       <w:r>
-        <w:t xml:space="preserve"> Este documento presenta los resultados de la verificación de calidad y seguridad del software Atlas, ejecutada sobre el código fuente entregado (Caso A) y el despliegue en Docker de laboratorio. El objetivo es determinar, con evidencias reproducibles, si el sistema cumple los requisitos funcionales y no funcionales del ERS, los estándares de calidad (ISO/IEC 25010), los controles de seguridad (ISO/IEC 27001, OWASP Top 10) y la normativa chilena de protección de datos (Ley 19.628 y Ley 21.719), para sustent</w:t>
-      </w:r>
-      <w:r>
-        <w:t>ar una decisión de certificación.</w:t>
+        <w:t xml:space="preserve"> Este documento presenta los resultados de la verificación de calidad y seguridad del software Atlas, ejecutada sobre el código fuente entregado (Caso A) y el despliegue en Docker de laboratorio. El objetivo es determinar, con evidencias reproducibles, si el sistema cumple los requisitos funcionales y no funcionales del ERS, los estándares de calidad (ISO/IEC 25010), los controles de seguridad (ISO/IEC 27001, OWASP Top 10) y la normativa chilena de protección de datos (Ley 19.628 y Ley 21.719), para sustentar una decisión de certificación.</w:t>
       </w:r>
     </w:p>
     <w:p>
@@ -2354,7 +2348,6 @@
         <w:rPr>
           <w:b/>
         </w:rPr>
-        <w:lastRenderedPageBreak/>
         <w:t>Cobertura ampliada al 100 % de los requerimientos del ERS:</w:t>
       </w:r>
       <w:r>
@@ -2456,10 +2449,7 @@
     </w:p>
     <w:p>
       <w:r>
-        <w:t xml:space="preserve">Conforme al </w:t>
-      </w:r>
-      <w:r>
-        <w:t>modelo ISO/IEC 25010 (SQuaRE), Atlas debe cumplir:</w:t>
+        <w:t>Conforme al modelo ISO/IEC 25010 (SQuaRE), Atlas debe cumplir:</w:t>
       </w:r>
     </w:p>
     <w:p>
@@ -2512,7 +2502,6 @@
         <w:rPr>
           <w:b/>
         </w:rPr>
-        <w:lastRenderedPageBreak/>
         <w:t>Confiabilidad:</w:t>
       </w:r>
       <w:r>
@@ -2736,7 +2725,6 @@
         <w:rPr>
           <w:b/>
         </w:rPr>
-        <w:lastRenderedPageBreak/>
         <w:t>Enfoque:</w:t>
       </w:r>
       <w:r>
@@ -2784,10 +2772,7 @@
         <w:pStyle w:val="ListNumber"/>
       </w:pPr>
       <w:r>
-        <w:t xml:space="preserve">Preparación del entorno (Docker Compose: frontend, backend y </w:t>
-      </w:r>
-      <w:r>
-        <w:t>PostgreSQL con datos semilla).</w:t>
+        <w:t>Preparación del entorno (Docker Compose: frontend, backend y PostgreSQL con datos semilla).</w:t>
       </w:r>
     </w:p>
     <w:p>
@@ -2916,7 +2901,6 @@
         <w:rPr>
           <w:b/>
         </w:rPr>
-        <w:lastRenderedPageBreak/>
         <w:t>Pruebas de integración:</w:t>
       </w:r>
       <w:r>
@@ -3228,14 +3212,7 @@
               <w:rPr>
                 <w:sz w:val="20"/>
               </w:rPr>
-              <w:t xml:space="preserve">Ejecución manual de pruebas </w:t>
-            </w:r>
-            <w:r>
-              <w:rPr>
-                <w:sz w:val="20"/>
-              </w:rPr>
-              <w:lastRenderedPageBreak/>
-              <w:t>sobre la API REST</w:t>
+              <w:t>Ejecución manual de pruebas sobre la API REST</w:t>
             </w:r>
           </w:p>
         </w:tc>
@@ -3251,15 +3228,7 @@
               <w:rPr>
                 <w:sz w:val="20"/>
               </w:rPr>
-              <w:lastRenderedPageBreak/>
-              <w:t xml:space="preserve">Permite controlar token, </w:t>
-            </w:r>
-            <w:r>
-              <w:rPr>
-                <w:sz w:val="20"/>
-              </w:rPr>
-              <w:lastRenderedPageBreak/>
-              <w:t>cabeceras y payloads, y registrar código HTTP como evidencia</w:t>
+              <w:t>Permite controlar token, cabeceras y payloads, y registrar código HTTP como evidencia</w:t>
             </w:r>
           </w:p>
         </w:tc>
@@ -3280,7 +3249,6 @@
               <w:rPr>
                 <w:sz w:val="20"/>
               </w:rPr>
-              <w:lastRenderedPageBreak/>
               <w:t>ESLint 9</w:t>
             </w:r>
           </w:p>
@@ -3419,13 +3387,7 @@
               <w:rPr>
                 <w:sz w:val="20"/>
               </w:rPr>
-              <w:t xml:space="preserve">Identifica hallazgos que las herramientas no cubren (control de </w:t>
-            </w:r>
-            <w:r>
-              <w:rPr>
-                <w:sz w:val="20"/>
-              </w:rPr>
-              <w:t>acceso, secretos, manejo de archivos)</w:t>
+              <w:t>Identifica hallazgos que las herramientas no cubren (control de acceso, secretos, manejo de archivos)</w:t>
             </w:r>
           </w:p>
         </w:tc>
@@ -3779,14 +3741,7 @@
               <w:rPr>
                 <w:sz w:val="20"/>
               </w:rPr>
-              <w:t xml:space="preserve">RF-1 / RF-1.1 (El sistema debe permitir autenticarse con nombre_usuario y </w:t>
-            </w:r>
-            <w:r>
-              <w:rPr>
-                <w:sz w:val="20"/>
-              </w:rPr>
-              <w:lastRenderedPageBreak/>
-              <w:t>contraseña)</w:t>
+              <w:t>RF-1 / RF-1.1 (El sistema debe permitir autenticarse con nombre_usuario y contraseña)</w:t>
             </w:r>
           </w:p>
         </w:tc>
@@ -3808,7 +3763,6 @@
                 <w:b/>
                 <w:sz w:val="20"/>
               </w:rPr>
-              <w:lastRenderedPageBreak/>
               <w:t>**Tipo de prueba**</w:t>
             </w:r>
           </w:p>
@@ -3939,13 +3893,7 @@
               <w:rPr>
                 <w:sz w:val="20"/>
               </w:rPr>
-              <w:t xml:space="preserve">1. Enviar `POST /autenticacion/login` con credenciales válidas. 2. Verificar código 200 y presencia de `token`. 3. Repetir con </w:t>
-            </w:r>
-            <w:r>
-              <w:rPr>
-                <w:sz w:val="20"/>
-              </w:rPr>
-              <w:t>contraseña incorrecta y verificar 401.</w:t>
+              <w:t>1. Enviar `POST /autenticacion/login` con credenciales válidas. 2. Verificar código 200 y presencia de `token`. 3. Repetir con contraseña incorrecta y verificar 401.</w:t>
             </w:r>
           </w:p>
         </w:tc>
@@ -4199,13 +4147,7 @@
               <w:rPr>
                 <w:sz w:val="20"/>
               </w:rPr>
-              <w:t xml:space="preserve">Listado de clientes de la </w:t>
-            </w:r>
-            <w:r>
-              <w:rPr>
-                <w:sz w:val="20"/>
-              </w:rPr>
-              <w:t>empresa autenticada</w:t>
+              <w:t>Listado de clientes de la empresa autenticada</w:t>
             </w:r>
           </w:p>
         </w:tc>
@@ -4509,13 +4451,7 @@
               <w:rPr>
                 <w:sz w:val="20"/>
               </w:rPr>
-              <w:t xml:space="preserve">Solo se retornan los clientes de la empresa del </w:t>
-            </w:r>
-            <w:r>
-              <w:rPr>
-                <w:sz w:val="20"/>
-              </w:rPr>
-              <w:t>usuario autenticado (RB-2); respuesta en formato JSON</w:t>
+              <w:t>Solo se retornan los clientes de la empresa del usuario autenticado (RB-2); respuesta en formato JSON</w:t>
             </w:r>
           </w:p>
         </w:tc>
@@ -4693,14 +4629,7 @@
               <w:rPr>
                 <w:sz w:val="20"/>
               </w:rPr>
-              <w:t xml:space="preserve">RF-5 / NFR-SEG (El sistema debe permitir </w:t>
-            </w:r>
-            <w:r>
-              <w:rPr>
-                <w:sz w:val="20"/>
-              </w:rPr>
-              <w:lastRenderedPageBreak/>
-              <w:t>adjuntar solo documentos seguros a un contrato)</w:t>
+              <w:t>RF-5 / NFR-SEG (El sistema debe permitir adjuntar solo documentos seguros a un contrato)</w:t>
             </w:r>
           </w:p>
         </w:tc>
@@ -4722,7 +4651,6 @@
                 <w:b/>
                 <w:sz w:val="20"/>
               </w:rPr>
-              <w:lastRenderedPageBreak/>
               <w:t>**Tipo de prueba**</w:t>
             </w:r>
           </w:p>
@@ -4815,13 +4743,7 @@
               <w:rPr>
                 <w:sz w:val="20"/>
               </w:rPr>
-              <w:t xml:space="preserve">Token válido; contrato existente; archivo </w:t>
-            </w:r>
-            <w:r>
-              <w:rPr>
-                <w:sz w:val="20"/>
-              </w:rPr>
-              <w:t>ejecutable de prueba disponible</w:t>
+              <w:t>Token válido; contrato existente; archivo ejecutable de prueba disponible</w:t>
             </w:r>
           </w:p>
         </w:tc>
@@ -5151,13 +5073,7 @@
               <w:rPr>
                 <w:sz w:val="20"/>
               </w:rPr>
-              <w:t xml:space="preserve">Acceso a datos de contrato sin </w:t>
-            </w:r>
-            <w:r>
-              <w:rPr>
-                <w:sz w:val="20"/>
-              </w:rPr>
-              <w:t>autenticación</w:t>
+              <w:t>Acceso a datos de contrato sin autenticación</w:t>
             </w:r>
           </w:p>
         </w:tc>
@@ -5585,7 +5501,6 @@
                 <w:b/>
                 <w:sz w:val="20"/>
               </w:rPr>
-              <w:lastRenderedPageBreak/>
               <w:t>**ID**</w:t>
             </w:r>
           </w:p>
@@ -6350,13 +6265,7 @@
               <w:rPr>
                 <w:sz w:val="20"/>
               </w:rPr>
-              <w:t xml:space="preserve">Dataset de clientes semilla + creados en </w:t>
-            </w:r>
-            <w:r>
-              <w:rPr>
-                <w:sz w:val="20"/>
-              </w:rPr>
-              <w:t>pruebas</w:t>
+              <w:t>Dataset de clientes semilla + creados en pruebas</w:t>
             </w:r>
           </w:p>
         </w:tc>
@@ -6623,7 +6532,6 @@
               <w:rPr>
                 <w:sz w:val="20"/>
               </w:rPr>
-              <w:lastRenderedPageBreak/>
               <w:t>RQ-01</w:t>
             </w:r>
           </w:p>
@@ -6725,13 +6633,7 @@
               <w:rPr>
                 <w:sz w:val="20"/>
               </w:rPr>
-              <w:t xml:space="preserve">El sistema debe </w:t>
-            </w:r>
-            <w:r>
-              <w:rPr>
-                <w:sz w:val="20"/>
-              </w:rPr>
-              <w:t>rechazar credenciales inválidas</w:t>
+              <w:t>El sistema debe rechazar credenciales inválidas</w:t>
             </w:r>
           </w:p>
         </w:tc>
@@ -7326,13 +7228,7 @@
               <w:rPr>
                 <w:sz w:val="20"/>
               </w:rPr>
-              <w:t xml:space="preserve">El sistema debe </w:t>
-            </w:r>
-            <w:r>
-              <w:rPr>
-                <w:sz w:val="20"/>
-              </w:rPr>
-              <w:t>mostrar métricas del dashboard</w:t>
+              <w:t>El sistema debe mostrar métricas del dashboard</w:t>
             </w:r>
           </w:p>
         </w:tc>
@@ -7587,13 +7483,7 @@
               <w:rPr>
                 <w:sz w:val="20"/>
               </w:rPr>
-              <w:t xml:space="preserve">El </w:t>
-            </w:r>
-            <w:r>
-              <w:rPr>
-                <w:sz w:val="20"/>
-              </w:rPr>
-              <w:t>login debe ser resistente a inyección SQL</w:t>
+              <w:t>El login debe ser resistente a inyección SQL</w:t>
             </w:r>
           </w:p>
         </w:tc>
@@ -7671,7 +7561,6 @@
           <w:color w:val="1F3B57"/>
           <w:sz w:val="24"/>
         </w:rPr>
-        <w:lastRenderedPageBreak/>
         <w:t>5. Ejecución de pruebas</w:t>
       </w:r>
       <w:bookmarkEnd w:id="14"/>
@@ -8007,13 +7896,7 @@
               <w:rPr>
                 <w:sz w:val="20"/>
               </w:rPr>
-              <w:t xml:space="preserve">11 (4 CRITICO · 5 </w:t>
-            </w:r>
-            <w:r>
-              <w:rPr>
-                <w:sz w:val="20"/>
-              </w:rPr>
-              <w:t>GRAVE · 1 MODERADO · 1 LEVE)</w:t>
+              <w:t>11 (4 CRITICO · 5 GRAVE · 1 MODERADO · 1 LEVE)</w:t>
             </w:r>
           </w:p>
         </w:tc>
@@ -8111,14 +7994,7 @@
                 <w:b/>
                 <w:sz w:val="20"/>
               </w:rPr>
-              <w:t xml:space="preserve">Tiempo promedio de respuesta con token </w:t>
-            </w:r>
-            <w:r>
-              <w:rPr>
-                <w:b/>
-                <w:sz w:val="20"/>
-              </w:rPr>
-              <w:t>válido</w:t>
+              <w:t>Tiempo promedio de respuesta con token válido</w:t>
             </w:r>
           </w:p>
         </w:tc>
@@ -8425,13 +8301,7 @@
               <w:rPr>
                 <w:sz w:val="20"/>
               </w:rPr>
-              <w:t xml:space="preserve">HTTP 401 </w:t>
-            </w:r>
-            <w:r>
-              <w:rPr>
-                <w:sz w:val="20"/>
-              </w:rPr>
-              <w:t>"Credenciales inválidas", sin enumeración de usuarios — Anexo A</w:t>
+              <w:t>HTTP 401 "Credenciales inválidas", sin enumeración de usuarios — Anexo A</w:t>
             </w:r>
           </w:p>
         </w:tc>
@@ -8941,14 +8811,7 @@
               <w:rPr>
                 <w:sz w:val="20"/>
               </w:rPr>
-              <w:t xml:space="preserve">HTTP 200; 6 contratos (2 semilla + 4 de prueba) — </w:t>
-            </w:r>
-            <w:r>
-              <w:rPr>
-                <w:sz w:val="20"/>
-              </w:rPr>
-              <w:lastRenderedPageBreak/>
-              <w:t>Anexo A</w:t>
+              <w:t>HTTP 200; 6 contratos (2 semilla + 4 de prueba) — Anexo A</w:t>
             </w:r>
           </w:p>
         </w:tc>
@@ -8964,7 +8827,6 @@
               <w:rPr>
                 <w:sz w:val="20"/>
               </w:rPr>
-              <w:lastRenderedPageBreak/>
               <w:t>Funcional</w:t>
             </w:r>
           </w:p>
@@ -9002,13 +8864,7 @@
               <w:rPr>
                 <w:sz w:val="20"/>
               </w:rPr>
-              <w:t xml:space="preserve">Dashboard / </w:t>
-            </w:r>
-            <w:r>
-              <w:rPr>
-                <w:sz w:val="20"/>
-              </w:rPr>
-              <w:t>métricas (token)</w:t>
+              <w:t>Dashboard / métricas (token)</w:t>
             </w:r>
           </w:p>
         </w:tc>
@@ -9178,13 +9034,7 @@
               <w:rPr>
                 <w:sz w:val="20"/>
               </w:rPr>
-              <w:t xml:space="preserve">Acceso a </w:t>
-            </w:r>
-            <w:r>
-              <w:rPr>
-                <w:sz w:val="20"/>
-              </w:rPr>
-              <w:t>contrato sin token (`GET /contratos/1`)</w:t>
+              <w:t>Acceso a contrato sin token (`GET /contratos/1`)</w:t>
             </w:r>
           </w:p>
         </w:tc>
@@ -9455,13 +9305,7 @@
               <w:rPr>
                 <w:sz w:val="20"/>
               </w:rPr>
-              <w:t xml:space="preserve">No conforme </w:t>
-            </w:r>
-            <w:r>
-              <w:rPr>
-                <w:sz w:val="20"/>
-              </w:rPr>
-              <w:t>(latencia artificial)</w:t>
+              <w:t>No conforme (latencia artificial)</w:t>
             </w:r>
           </w:p>
         </w:tc>
@@ -9670,13 +9514,7 @@
               <w:rPr>
                 <w:sz w:val="20"/>
               </w:rPr>
-              <w:t xml:space="preserve">El defecto impide </w:t>
-            </w:r>
-            <w:r>
-              <w:rPr>
-                <w:sz w:val="20"/>
-              </w:rPr>
-              <w:t>completamente el funcionamiento o expone datos sensibles; vulnera seguridad o una funcionalidad esencial del negocio</w:t>
+              <w:t>El defecto impide completamente el funcionamiento o expone datos sensibles; vulnera seguridad o una funcionalidad esencial del negocio</w:t>
             </w:r>
           </w:p>
         </w:tc>
@@ -9708,13 +9546,7 @@
               <w:rPr>
                 <w:sz w:val="20"/>
               </w:rPr>
-              <w:t xml:space="preserve">Reproducción con evidencia (código HTTP, captura, log o hallazgo </w:t>
-            </w:r>
-            <w:r>
-              <w:rPr>
-                <w:sz w:val="20"/>
-              </w:rPr>
-              <w:t>estático)</w:t>
+              <w:t>Reproducción con evidencia (código HTTP, captura, log o hallazgo estático)</w:t>
             </w:r>
           </w:p>
         </w:tc>
@@ -9852,14 +9684,7 @@
               <w:rPr>
                 <w:sz w:val="20"/>
               </w:rPr>
-              <w:t xml:space="preserve">Afecta </w:t>
-            </w:r>
-            <w:r>
-              <w:rPr>
-                <w:sz w:val="20"/>
-              </w:rPr>
-              <w:lastRenderedPageBreak/>
-              <w:t>funcionalidades secundarias o casos específicos sin detener el flujo principal</w:t>
+              <w:t>Afecta funcionalidades secundarias o casos específicos sin detener el flujo principal</w:t>
             </w:r>
           </w:p>
         </w:tc>
@@ -9875,15 +9700,7 @@
               <w:rPr>
                 <w:sz w:val="20"/>
               </w:rPr>
-              <w:lastRenderedPageBreak/>
-              <w:t xml:space="preserve">Medio: el </w:t>
-            </w:r>
-            <w:r>
-              <w:rPr>
-                <w:sz w:val="20"/>
-              </w:rPr>
-              <w:lastRenderedPageBreak/>
-              <w:t>usuario puede trabajar con molestias o limitaciones</w:t>
+              <w:t>Medio: el usuario puede trabajar con molestias o limitaciones</w:t>
             </w:r>
           </w:p>
         </w:tc>
@@ -9899,15 +9716,7 @@
               <w:rPr>
                 <w:sz w:val="20"/>
               </w:rPr>
-              <w:lastRenderedPageBreak/>
-              <w:t xml:space="preserve">Registro de </w:t>
-            </w:r>
-            <w:r>
-              <w:rPr>
-                <w:sz w:val="20"/>
-              </w:rPr>
-              <w:lastRenderedPageBreak/>
-              <w:t>prueba con métrica o comparación</w:t>
+              <w:t>Registro de prueba con métrica o comparación</w:t>
             </w:r>
           </w:p>
         </w:tc>
@@ -9923,21 +9732,7 @@
               <w:rPr>
                 <w:sz w:val="20"/>
               </w:rPr>
-              <w:lastRenderedPageBreak/>
-              <w:t xml:space="preserve">Se </w:t>
-            </w:r>
-            <w:r>
-              <w:rPr>
-                <w:sz w:val="20"/>
-              </w:rPr>
-              <w:t xml:space="preserve">corrige en </w:t>
-            </w:r>
-            <w:r>
-              <w:rPr>
-                <w:sz w:val="20"/>
-              </w:rPr>
-              <w:lastRenderedPageBreak/>
-              <w:t>próxima iteración</w:t>
+              <w:t>Se corrige en próxima iteración</w:t>
             </w:r>
           </w:p>
         </w:tc>
@@ -9958,7 +9753,6 @@
               <w:rPr>
                 <w:sz w:val="20"/>
               </w:rPr>
-              <w:lastRenderedPageBreak/>
               <w:t>LEVE</w:t>
             </w:r>
           </w:p>
@@ -10509,13 +10303,7 @@
               <w:rPr>
                 <w:sz w:val="20"/>
               </w:rPr>
-              <w:t xml:space="preserve">CORS con </w:t>
-            </w:r>
-            <w:r>
-              <w:rPr>
-                <w:sz w:val="20"/>
-              </w:rPr>
-              <w:t>`Access-Control-Allow-Origin: *` global (`app.js:22`)</w:t>
+              <w:t>CORS con `Access-Control-Allow-Origin: *` global (`app.js:22`)</w:t>
             </w:r>
           </w:p>
         </w:tc>
@@ -10584,14 +10372,7 @@
               <w:rPr>
                 <w:sz w:val="20"/>
               </w:rPr>
-              <w:t xml:space="preserve">Ausencia de rate-limit </w:t>
-            </w:r>
-            <w:r>
-              <w:rPr>
-                <w:sz w:val="20"/>
-              </w:rPr>
-              <w:lastRenderedPageBreak/>
-              <w:t>/ bloqueo por fuerza bruta en login</w:t>
+              <w:t>Ausencia de rate-limit / bloqueo por fuerza bruta en login</w:t>
             </w:r>
           </w:p>
         </w:tc>
@@ -10607,15 +10388,7 @@
               <w:rPr>
                 <w:sz w:val="20"/>
               </w:rPr>
-              <w:lastRenderedPageBreak/>
-              <w:t xml:space="preserve">Ataque de fuerza </w:t>
-            </w:r>
-            <w:r>
-              <w:rPr>
-                <w:sz w:val="20"/>
-              </w:rPr>
-              <w:lastRenderedPageBreak/>
-              <w:t>bruta viable (SEG-13)</w:t>
+              <w:t>Ataque de fuerza bruta viable (SEG-13)</w:t>
             </w:r>
           </w:p>
         </w:tc>
@@ -10631,7 +10404,6 @@
               <w:rPr>
                 <w:sz w:val="20"/>
               </w:rPr>
-              <w:lastRenderedPageBreak/>
               <w:t>GRAVE</w:t>
             </w:r>
           </w:p>
@@ -11027,7 +10799,6 @@
           <w:color w:val="1F3B57"/>
           <w:sz w:val="24"/>
         </w:rPr>
-        <w:lastRenderedPageBreak/>
         <w:t>6.2. Consideraciones normativas</w:t>
       </w:r>
       <w:bookmarkEnd w:id="20"/>
@@ -11158,7 +10929,6 @@
         <w:pStyle w:val="ListNumber"/>
       </w:pPr>
       <w:r>
-        <w:lastRenderedPageBreak/>
         <w:t>Hash seguro de contraseñas (bcrypt/argon2) y eliminación de credenciales por defecto con cambio obligatorio en primer acceso (BUG-002).</w:t>
       </w:r>
     </w:p>
@@ -11581,13 +11351,7 @@
               <w:rPr>
                 <w:sz w:val="20"/>
               </w:rPr>
-              <w:t xml:space="preserve">HTTP 401 </w:t>
-            </w:r>
-            <w:r>
-              <w:rPr>
-                <w:sz w:val="20"/>
-              </w:rPr>
-              <w:t>"Credenciales inválidas" en ~4,01 s. No enumera usuarios</w:t>
+              <w:t>HTTP 401 "Credenciales inválidas" en ~4,01 s. No enumera usuarios</w:t>
             </w:r>
           </w:p>
         </w:tc>
@@ -11769,13 +11533,7 @@
         <w:rPr>
           <w:b/>
         </w:rPr>
-        <w:t xml:space="preserve">Ciclo 2 · Ejecución de </w:t>
-      </w:r>
-      <w:r>
-        <w:rPr>
-          <w:b/>
-        </w:rPr>
-        <w:t>casos de prueba</w:t>
+        <w:t>Ciclo 2 · Ejecución de casos de prueba</w:t>
       </w:r>
     </w:p>
     <w:tbl>
@@ -11972,14 +11730,7 @@
               <w:rPr>
                 <w:sz w:val="20"/>
               </w:rPr>
-              <w:t xml:space="preserve">HTTP 200 en ~4,06 s; retorna 3 clientes (2 </w:t>
-            </w:r>
-            <w:r>
-              <w:rPr>
-                <w:sz w:val="20"/>
-              </w:rPr>
-              <w:lastRenderedPageBreak/>
-              <w:t>semilla + 1 creado)</w:t>
+              <w:t>HTTP 200 en ~4,06 s; retorna 3 clientes (2 semilla + 1 creado)</w:t>
             </w:r>
           </w:p>
         </w:tc>
@@ -12000,7 +11751,6 @@
               <w:rPr>
                 <w:sz w:val="20"/>
               </w:rPr>
-              <w:lastRenderedPageBreak/>
               <w:t>CP-006</w:t>
             </w:r>
           </w:p>
@@ -12320,13 +12070,7 @@
               <w:rPr>
                 <w:sz w:val="20"/>
               </w:rPr>
-              <w:t xml:space="preserve">HTTP 200; 2 usuarios, 3 </w:t>
-            </w:r>
-            <w:r>
-              <w:rPr>
-                <w:sz w:val="20"/>
-              </w:rPr>
-              <w:t>clientes</w:t>
+              <w:t>HTTP 200; 2 usuarios, 3 clientes</w:t>
             </w:r>
           </w:p>
         </w:tc>
@@ -12496,13 +12240,7 @@
               <w:rPr>
                 <w:sz w:val="20"/>
               </w:rPr>
-              <w:t xml:space="preserve">HTTP 200 devuelve datos del contrato sin </w:t>
-            </w:r>
-            <w:r>
-              <w:rPr>
-                <w:sz w:val="20"/>
-              </w:rPr>
-              <w:t>autenticación</w:t>
+              <w:t>HTTP 200 devuelve datos del contrato sin autenticación</w:t>
             </w:r>
           </w:p>
         </w:tc>
@@ -12958,13 +12696,7 @@
               <w:rPr>
                 <w:sz w:val="20"/>
               </w:rPr>
-              <w:t xml:space="preserve">**200 </w:t>
-            </w:r>
-            <w:r>
-              <w:rPr>
-                <w:sz w:val="20"/>
-              </w:rPr>
-              <w:t>(logs internos)**</w:t>
+              <w:t>**200 (logs internos)**</w:t>
             </w:r>
           </w:p>
         </w:tc>
@@ -13357,14 +13089,7 @@
               <w:rPr>
                 <w:sz w:val="20"/>
               </w:rPr>
-              <w:t xml:space="preserve">Acceso con token </w:t>
-            </w:r>
-            <w:r>
-              <w:rPr>
-                <w:sz w:val="20"/>
-              </w:rPr>
-              <w:lastRenderedPageBreak/>
-              <w:t>válido a recurso propio</w:t>
+              <w:t>Acceso con token válido a recurso propio</w:t>
             </w:r>
           </w:p>
         </w:tc>
@@ -13380,7 +13105,6 @@
               <w:rPr>
                 <w:sz w:val="20"/>
               </w:rPr>
-              <w:lastRenderedPageBreak/>
               <w:t>200</w:t>
             </w:r>
           </w:p>
@@ -13607,14 +13331,7 @@
           <w:i/>
           <w:sz w:val="20"/>
         </w:rPr>
-        <w:t xml:space="preserve">Las </w:t>
-      </w:r>
-      <w:r>
-        <w:rPr>
-          <w:i/>
-          <w:sz w:val="20"/>
-        </w:rPr>
-        <w:t>pruebas SEG-08b y SEG-11a se integran como evidencia dentro de SEG-07b y SEG-01, respectivamente. SEG-09 corresponde al hallazgo de `JWT_SECRET` detectado por revisión manual (BUG-004) y no se contabiliza como prueba dinámica independiente. FN-02 (rendimiento) se registra en el Anexo A como prueba no funcional, no como SEG.</w:t>
+        <w:t>Las pruebas SEG-08b y SEG-11a se integran como evidencia dentro de SEG-07b y SEG-01, respectivamente. SEG-09 corresponde al hallazgo de `JWT_SECRET` detectado por revisión manual (BUG-004) y no se contabiliza como prueba dinámica independiente. FN-02 (rendimiento) se registra en el Anexo A como prueba no funcional, no como SEG.</w:t>
       </w:r>
     </w:p>
     <w:p>
@@ -13799,13 +13516,7 @@
               <w:rPr>
                 <w:sz w:val="20"/>
               </w:rPr>
-              <w:t xml:space="preserve">no-unused-vars </w:t>
-            </w:r>
-            <w:r>
-              <w:rPr>
-                <w:sz w:val="20"/>
-              </w:rPr>
-              <w:t>(`onLoad`)</w:t>
+              <w:t>no-unused-vars (`onLoad`)</w:t>
             </w:r>
           </w:p>
         </w:tc>
@@ -14461,13 +14172,7 @@
               <w:rPr>
                 <w:sz w:val="20"/>
               </w:rPr>
-              <w:t xml:space="preserve">no-unused-vars </w:t>
-            </w:r>
-            <w:r>
-              <w:rPr>
-                <w:sz w:val="20"/>
-              </w:rPr>
-              <w:t>(`path`, `fs`)</w:t>
+              <w:t>no-unused-vars (`path`, `fs`)</w:t>
             </w:r>
           </w:p>
         </w:tc>
@@ -14641,13 +14346,7 @@
               <w:rPr>
                 <w:sz w:val="20"/>
               </w:rPr>
-              <w:t xml:space="preserve">Comparación de contraseña en texto claro </w:t>
-            </w:r>
-            <w:r>
-              <w:rPr>
-                <w:sz w:val="20"/>
-              </w:rPr>
-              <w:t>(`user.contrasena_hash !== password`)</w:t>
+              <w:t>Comparación de contraseña en texto claro (`user.contrasena_hash !== password`)</w:t>
             </w:r>
           </w:p>
         </w:tc>
@@ -15516,21 +15215,12 @@
           <w:color w:val="1F3B57"/>
           <w:sz w:val="24"/>
         </w:rPr>
-        <w:t xml:space="preserve">Anexo E · Análisis </w:t>
-      </w:r>
-      <w:r>
-        <w:rPr>
-          <w:b/>
-          <w:color w:val="1F3B57"/>
-          <w:sz w:val="24"/>
-        </w:rPr>
-        <w:t>estático con SonarQube (servidor local :9000)</w:t>
+        <w:t>Anexo E · Análisis estático con SonarQube (servidor local :9000)</w:t>
       </w:r>
       <w:bookmarkEnd w:id="27"/>
     </w:p>
     <w:p>
       <w:r>
-        <w:lastRenderedPageBreak/>
         <w:t xml:space="preserve">Se desplegó un servidor </w:t>
       </w:r>
       <w:r>
@@ -16237,14 +15927,7 @@
           <w:i/>
           <w:sz w:val="20"/>
         </w:rPr>
-        <w:t xml:space="preserve">El Security Rating E del backend confirma los problemas de seguridad críticos detectados en las pruebas dinámicas y en </w:t>
-      </w:r>
-      <w:r>
-        <w:rPr>
-          <w:i/>
-          <w:sz w:val="20"/>
-        </w:rPr>
-        <w:t>la revisión manual. El Quality Gate figura "OK" porque el Quality Gate por defecto solo evalúa bugs y deuda técnica; en las recomendaciones se incluye agregar condiciones de seguridad.</w:t>
+        <w:t>El Security Rating E del backend confirma los problemas de seguridad críticos detectados en las pruebas dinámicas y en la revisión manual. El Quality Gate figura "OK" porque el Quality Gate por defecto solo evalúa bugs y deuda técnica; en las recomendaciones se incluye agregar condiciones de seguridad.</w:t>
       </w:r>
     </w:p>
     <w:p>
@@ -16436,7 +16119,6 @@
         <w:rPr>
           <w:rFonts w:ascii="Courier New" w:hAnsi="Courier New"/>
         </w:rPr>
-        <w:lastRenderedPageBreak/>
         <w:t>app.js:20</w:t>
       </w:r>
       <w:r>
@@ -16618,14 +16300,7 @@
           <w:rFonts w:ascii="Courier New" w:hAnsi="Courier New"/>
           <w:sz w:val="18"/>
         </w:rPr>
-        <w:t xml:space="preserve"># 1) Servidor </w:t>
-      </w:r>
-      <w:r>
-        <w:rPr>
-          <w:rFonts w:ascii="Courier New" w:hAnsi="Courier New"/>
-          <w:sz w:val="18"/>
-        </w:rPr>
-        <w:t>SonarQube</w:t>
+        <w:t># 1) Servidor SonarQube</w:t>
       </w:r>
     </w:p>
     <w:p>
@@ -16776,9 +16451,8 @@
         <w:rPr>
           <w:noProof/>
         </w:rPr>
-        <w:lastRenderedPageBreak/>
         <w:drawing>
-          <wp:inline distT="0" distB="0" distL="0" distR="0">
+          <wp:inline distT="0" distB="0" distL="0" distR="0" wp14:anchorId="6DC11C02" wp14:editId="245C57F6">
             <wp:extent cx="5943600" cy="3714750"/>
             <wp:effectExtent l="0" t="0" r="0" b="0"/>
             <wp:docPr id="1" name="Picture 1"/>
@@ -16842,9 +16516,8 @@
         <w:rPr>
           <w:noProof/>
         </w:rPr>
-        <w:lastRenderedPageBreak/>
         <w:drawing>
-          <wp:inline distT="0" distB="0" distL="0" distR="0">
+          <wp:inline distT="0" distB="0" distL="0" distR="0" wp14:anchorId="05A74D1D" wp14:editId="7E4615B7">
             <wp:extent cx="5943600" cy="3714750"/>
             <wp:effectExtent l="0" t="0" r="0" b="0"/>
             <wp:docPr id="2" name="Picture 2"/>
@@ -16908,9 +16581,8 @@
         <w:rPr>
           <w:noProof/>
         </w:rPr>
-        <w:lastRenderedPageBreak/>
         <w:drawing>
-          <wp:inline distT="0" distB="0" distL="0" distR="0">
+          <wp:inline distT="0" distB="0" distL="0" distR="0" wp14:anchorId="61BC18EC" wp14:editId="0814F0ED">
             <wp:extent cx="5943600" cy="3714750"/>
             <wp:effectExtent l="0" t="0" r="0" b="0"/>
             <wp:docPr id="3" name="Picture 3"/>
@@ -16955,13 +16627,7 @@
         <w:rPr>
           <w:sz w:val="18"/>
         </w:rPr>
-        <w:t xml:space="preserve">Vulnerabilidad </w:t>
-      </w:r>
-      <w:r>
-        <w:rPr>
-          <w:sz w:val="18"/>
-        </w:rPr>
-        <w:t>BLOCKER secrets:S6698 - db.js:6</w:t>
+        <w:t>Vulnerabilidad BLOCKER secrets:S6698 - db.js:6</w:t>
       </w:r>
     </w:p>
     <w:p>
@@ -16980,9 +16646,8 @@
         <w:rPr>
           <w:noProof/>
         </w:rPr>
-        <w:lastRenderedPageBreak/>
         <w:drawing>
-          <wp:inline distT="0" distB="0" distL="0" distR="0">
+          <wp:inline distT="0" distB="0" distL="0" distR="0" wp14:anchorId="266B69C0" wp14:editId="01C4A054">
             <wp:extent cx="5943600" cy="3714750"/>
             <wp:effectExtent l="0" t="0" r="0" b="0"/>
             <wp:docPr id="4" name="Picture 4"/>
@@ -17046,9 +16711,8 @@
         <w:rPr>
           <w:noProof/>
         </w:rPr>
-        <w:lastRenderedPageBreak/>
         <w:drawing>
-          <wp:inline distT="0" distB="0" distL="0" distR="0">
+          <wp:inline distT="0" distB="0" distL="0" distR="0" wp14:anchorId="6F47651E" wp14:editId="20FF2F5B">
             <wp:extent cx="5943600" cy="3714750"/>
             <wp:effectExtent l="0" t="0" r="0" b="0"/>
             <wp:docPr id="5" name="Picture 5"/>
@@ -17112,9 +16776,8 @@
         <w:rPr>
           <w:noProof/>
         </w:rPr>
-        <w:lastRenderedPageBreak/>
         <w:drawing>
-          <wp:inline distT="0" distB="0" distL="0" distR="0">
+          <wp:inline distT="0" distB="0" distL="0" distR="0" wp14:anchorId="78C87F69" wp14:editId="3ECCD8AE">
             <wp:extent cx="5943600" cy="3714750"/>
             <wp:effectExtent l="0" t="0" r="0" b="0"/>
             <wp:docPr id="6" name="Picture 6"/>
@@ -17178,9 +16841,8 @@
         <w:rPr>
           <w:noProof/>
         </w:rPr>
-        <w:lastRenderedPageBreak/>
         <w:drawing>
-          <wp:inline distT="0" distB="0" distL="0" distR="0">
+          <wp:inline distT="0" distB="0" distL="0" distR="0" wp14:anchorId="53A156AA" wp14:editId="6F868E39">
             <wp:extent cx="5943600" cy="3714750"/>
             <wp:effectExtent l="0" t="0" r="0" b="0"/>
             <wp:docPr id="7" name="Picture 7"/>
@@ -17244,9 +16906,8 @@
         <w:rPr>
           <w:noProof/>
         </w:rPr>
-        <w:lastRenderedPageBreak/>
         <w:drawing>
-          <wp:inline distT="0" distB="0" distL="0" distR="0">
+          <wp:inline distT="0" distB="0" distL="0" distR="0" wp14:anchorId="180B1214" wp14:editId="7BC135FF">
             <wp:extent cx="5943600" cy="3714750"/>
             <wp:effectExtent l="0" t="0" r="0" b="0"/>
             <wp:docPr id="8" name="Picture 8"/>
@@ -29001,6 +28662,7 @@
     <w:rsid w:val="00177D2F"/>
     <w:pPr>
       <w:spacing w:after="0"/>
+      <w:jc w:val="left"/>
     </w:pPr>
     <w:rPr>
       <w:rFonts w:cs="Arial"/>
@@ -29018,6 +28680,7 @@
     <w:pPr>
       <w:spacing w:after="0"/>
       <w:ind w:left="220"/>
+      <w:jc w:val="left"/>
     </w:pPr>
     <w:rPr>
       <w:rFonts w:cs="Arial"/>
@@ -29046,6 +28709,7 @@
     <w:pPr>
       <w:spacing w:after="0"/>
       <w:ind w:left="440"/>
+      <w:jc w:val="left"/>
     </w:pPr>
     <w:rPr>
       <w:rFonts w:cs="Arial"/>

</xml_diff>